<commit_message>
sửa ui app hiệp hội
</commit_message>
<xml_diff>
--- a/document/HUONG_DAN_SU_DUNG_CRM.docx
+++ b/document/HUONG_DAN_SU_DUNG_CRM.docx
@@ -3979,202 +3979,6 @@
                     </pic:cNvPicPr>
                   </pic:nvPicPr>
                   <pic:blipFill>
-                    <a:blip r:embed="rId24" cstate="none"/>
-                    <a:srcRect/>
-                    <a:stretch>
-                      <a:fillRect/>
-                    </a:stretch>
-                  </pic:blipFill>
-                  <pic:spPr bwMode="auto">
-                    <a:xfrm>
-                      <a:off x="0" y="0"/>
-                      <a:ext cx="4762500" cy="2667000"/>
-                    </a:xfrm>
-                    <a:prstGeom prst="rect">
-                      <a:avLst/>
-                    </a:prstGeom>
-                  </pic:spPr>
-                </pic:pic>
-              </a:graphicData>
-            </a:graphic>
-          </wp:inline>
-        </w:drawing>
-      </w:r>
-    </w:p>
-    <w:p>
-      <w:pPr>
-        <w:spacing w:after="140"/>
-        <w:jc w:val="center"/>
-      </w:pPr>
-      <w:r>
-        <w:rPr>
-          <w:i/>
-          <w:iCs/>
-          <w:color w:val="555555"/>
-          <w:sz w:val="18"/>
-          <w:szCs w:val="18"/>
-        </w:rPr>
-        <w:t xml:space="preserve">Hình minh họa: CRM: Thao tác Bật/Tắt Gạch nợ Hội phí</w:t>
-      </w:r>
-    </w:p>
-    <w:p>
-      <w:pPr>
-        <w:spacing w:after="100"/>
-      </w:pPr>
-      <w:r>
-        <w:rPr>
-          <w:sz w:val="21"/>
-          <w:szCs w:val="21"/>
-        </w:rPr>
-        <w:t xml:space="preserve">*Hình 10.2: Công tắc gạch nợ hội phí trên CRM - Cập nhật tự động quyền lợi và hạn thẻ VIP trên App.*</w:t>
-      </w:r>
-    </w:p>
-    <w:p>
-      <w:pPr>
-        <w:spacing w:after="100"/>
-      </w:pPr>
-      <w:r>
-        <w:rPr>
-          <w:sz w:val="21"/>
-          <w:szCs w:val="21"/>
-        </w:rPr>
-        <w:t xml:space="preserve">---</w:t>
-      </w:r>
-    </w:p>
-    <w:p>
-      <w:pPr>
-        <w:pStyle w:val="Heading2"/>
-        <w:spacing w:after="100" w:before="240"/>
-      </w:pPr>
-      <w:r>
-        <w:t xml:space="preserve">11. QUẢN LÝ TIN TỨC, NGHỊ QUYẾT &amp; TRUYỀN THÔNG (NEWS &amp; MEDIA)</w:t>
-      </w:r>
-    </w:p>
-    <w:p>
-      <w:pPr>
-        <w:spacing w:after="100"/>
-      </w:pPr>
-      <w:r>
-        <w:rPr>
-          <w:sz w:val="21"/>
-          <w:szCs w:val="21"/>
-        </w:rPr>
-        <w:t xml:space="preserve">1. Truy cập CRM menu **"Truyền thông &amp; Tin tức"** (`/news`).</w:t>
-      </w:r>
-    </w:p>
-    <w:p>
-      <w:pPr>
-        <w:spacing w:after="100"/>
-      </w:pPr>
-      <w:r>
-        <w:rPr>
-          <w:sz w:val="21"/>
-          <w:szCs w:val="21"/>
-        </w:rPr>
-        <w:t xml:space="preserve">2. Nhấn nút **"+ Soạn Tin Mới"**:</w:t>
-      </w:r>
-    </w:p>
-    <w:p>
-      <w:pPr>
-        <w:pStyle w:val="ListParagraph"/>
-        <w:numPr>
-          <w:ilvl w:val="0"/>
-          <w:numId w:val="1"/>
-        </w:numPr>
-        <w:spacing w:after="60"/>
-      </w:pPr>
-      <w:r>
-        <w:t xml:space="preserve">Nhập Tiêu đề bản tin hoạt động hiệp hội.</w:t>
-      </w:r>
-    </w:p>
-    <w:p>
-      <w:pPr>
-        <w:pStyle w:val="ListParagraph"/>
-        <w:numPr>
-          <w:ilvl w:val="0"/>
-          <w:numId w:val="1"/>
-        </w:numPr>
-        <w:spacing w:after="60"/>
-      </w:pPr>
-      <w:r>
-        <w:t xml:space="preserve">Chọn Chuyên mục: Tin Đại hội, Bản tin Xúc tiến Thương mại, Quyết định Ban Chấp Hành, Tin Doanh nghiệp Hội viên.</w:t>
-      </w:r>
-    </w:p>
-    <w:p>
-      <w:pPr>
-        <w:pStyle w:val="ListParagraph"/>
-        <w:numPr>
-          <w:ilvl w:val="0"/>
-          <w:numId w:val="1"/>
-        </w:numPr>
-        <w:spacing w:after="60"/>
-      </w:pPr>
-      <w:r>
-        <w:t xml:space="preserve">Tải lên ảnh bìa và các hình ảnh phóng sự chất lượng cao.</w:t>
-      </w:r>
-    </w:p>
-    <w:p>
-      <w:pPr>
-        <w:pStyle w:val="ListParagraph"/>
-        <w:numPr>
-          <w:ilvl w:val="0"/>
-          <w:numId w:val="1"/>
-        </w:numPr>
-        <w:spacing w:after="60"/>
-      </w:pPr>
-      <w:r>
-        <w:t xml:space="preserve">Soạn thảo nội dung bài viết với trình soạn thảo phong phú (Rich Text Editor).</w:t>
-      </w:r>
-    </w:p>
-    <w:p>
-      <w:pPr>
-        <w:spacing w:after="100"/>
-      </w:pPr>
-      <w:r>
-        <w:rPr>
-          <w:sz w:val="21"/>
-          <w:szCs w:val="21"/>
-        </w:rPr>
-        <w:t xml:space="preserve">3. Tùy chọn **"Gửi Thông Báo Đẩy (Push Notification) Tới App"**:</w:t>
-      </w:r>
-    </w:p>
-    <w:p>
-      <w:pPr>
-        <w:pStyle w:val="ListParagraph"/>
-        <w:numPr>
-          <w:ilvl w:val="0"/>
-          <w:numId w:val="1"/>
-        </w:numPr>
-        <w:spacing w:after="60"/>
-      </w:pPr>
-      <w:r>
-        <w:t xml:space="preserve">Khi tích chọn mục này và nhấn **"Xuất bản"**, toàn bộ điện thoại của hội viên sẽ nhận được thông báo về tin tức mới.</w:t>
-      </w:r>
-    </w:p>
-    <w:p>
-      <w:pPr>
-        <w:spacing w:after="60" w:before="140"/>
-        <w:jc w:val="center"/>
-      </w:pPr>
-      <w:r>
-        <w:drawing>
-          <wp:inline distT="0" distB="0" distL="0" distR="0">
-            <wp:extent cx="4762500" cy="2667000"/>
-            <wp:effectExtent t="0" r="0" b="0" l="0"/>
-            <wp:docPr id="1" name="" descr="" title=""/>
-            <wp:cNvGraphicFramePr>
-              <a:graphicFrameLocks xmlns:a="http://schemas.openxmlformats.org/drawingml/2006/main" noChangeAspect="1"/>
-            </wp:cNvGraphicFramePr>
-            <a:graphic xmlns:a="http://schemas.openxmlformats.org/drawingml/2006/main">
-              <a:graphicData uri="http://schemas.openxmlformats.org/drawingml/2006/picture">
-                <pic:pic xmlns:pic="http://schemas.openxmlformats.org/drawingml/2006/picture">
-                  <pic:nvPicPr>
-                    <pic:cNvPr id="0" name="" descr=""/>
-                    <pic:cNvPicPr>
-                      <a:picLocks noChangeAspect="1" noChangeArrowheads="1"/>
-                    </pic:cNvPicPr>
-                  </pic:nvPicPr>
-                  <pic:blipFill>
                     <a:blip r:embed="rId25" cstate="none"/>
                     <a:srcRect/>
                     <a:stretch>
@@ -4210,19 +4014,19 @@
           <w:sz w:val="18"/>
           <w:szCs w:val="18"/>
         </w:rPr>
-        <w:t xml:space="preserve">Hình minh họa: CRM: Quản lý Tin tức, Bài viết và Truyền thông</w:t>
-      </w:r>
-    </w:p>
-    <w:p>
-      <w:pPr>
-        <w:spacing w:after="100"/>
-      </w:pPr>
-      <w:r>
-        <w:rPr>
-          <w:sz w:val="21"/>
-          <w:szCs w:val="21"/>
-        </w:rPr>
-        <w:t xml:space="preserve">*Hình 11.1: Trình quản lý và xuất bản tin tức, nghị quyết hiệp hội đến ứng dụng di động.*</w:t>
+        <w:t xml:space="preserve">Hình minh họa: CRM: Thao tác Bật/Tắt Gạch nợ Hội phí</w:t>
+      </w:r>
+    </w:p>
+    <w:p>
+      <w:pPr>
+        <w:spacing w:after="100"/>
+      </w:pPr>
+      <w:r>
+        <w:rPr>
+          <w:sz w:val="21"/>
+          <w:szCs w:val="21"/>
+        </w:rPr>
+        <w:t xml:space="preserve">*Hình 10.2: Công tắc gạch nợ hội phí trên CRM - Cập nhật tự động quyền lợi và hạn thẻ VIP trên App.*</w:t>
       </w:r>
     </w:p>
     <w:p>
@@ -4243,104 +4047,108 @@
         <w:spacing w:after="100" w:before="240"/>
       </w:pPr>
       <w:r>
-        <w:t xml:space="preserve">12. CẤU HÌNH HỆ THỐNG, TÀI KHOẢN VIETQR THỤ HƯỞNG &amp; NHẬT KÝ KIỂM TOÁN</w:t>
-      </w:r>
-    </w:p>
-    <w:p>
-      <w:pPr>
-        <w:pStyle w:val="Heading3"/>
-        <w:spacing w:after="80" w:before="180"/>
-      </w:pPr>
-      <w:r>
-        <w:t xml:space="preserve">12.1. Cấu Hình Tài Khoản VietQR Thụ Hưởng</w:t>
-      </w:r>
-    </w:p>
-    <w:p>
-      <w:pPr>
-        <w:spacing w:after="100"/>
-      </w:pPr>
-      <w:r>
-        <w:rPr>
-          <w:sz w:val="21"/>
-          <w:szCs w:val="21"/>
-        </w:rPr>
-        <w:t xml:space="preserve">1. Truy cập CRM menu **"Cài đặt Hệ thống" ➔ "Tài chính &amp; Thanh toán"**.</w:t>
-      </w:r>
-    </w:p>
-    <w:p>
-      <w:pPr>
-        <w:spacing w:after="100"/>
-      </w:pPr>
-      <w:r>
-        <w:rPr>
-          <w:sz w:val="21"/>
-          <w:szCs w:val="21"/>
-        </w:rPr>
-        <w:t xml:space="preserve">2. Thiết lập thông tin tài khoản ngân hàng chính thức của CLB Doanh nhân CEO 1983:</w:t>
-      </w:r>
-    </w:p>
-    <w:p>
-      <w:pPr>
-        <w:pStyle w:val="ListParagraph"/>
-        <w:numPr>
-          <w:ilvl w:val="0"/>
-          <w:numId w:val="1"/>
-        </w:numPr>
-        <w:spacing w:after="60"/>
-      </w:pPr>
-      <w:r>
-        <w:t xml:space="preserve">Tên ngân hàng thụ hưởng (vd: Vietcombank, MB Bank, Techcombank).</w:t>
-      </w:r>
-    </w:p>
-    <w:p>
-      <w:pPr>
-        <w:pStyle w:val="ListParagraph"/>
-        <w:numPr>
-          <w:ilvl w:val="0"/>
-          <w:numId w:val="1"/>
-        </w:numPr>
-        <w:spacing w:after="60"/>
-      </w:pPr>
-      <w:r>
-        <w:t xml:space="preserve">Số tài khoản ngân hàng.</w:t>
-      </w:r>
-    </w:p>
-    <w:p>
-      <w:pPr>
-        <w:pStyle w:val="ListParagraph"/>
-        <w:numPr>
-          <w:ilvl w:val="0"/>
-          <w:numId w:val="1"/>
-        </w:numPr>
-        <w:spacing w:after="60"/>
-      </w:pPr>
-      <w:r>
-        <w:t xml:space="preserve">Tên chủ tài khoản: `CLB DOANH NHAN CEO 1983` hoặc đại diện được ủy quyền.</w:t>
-      </w:r>
-    </w:p>
-    <w:p>
-      <w:pPr>
-        <w:pStyle w:val="ListParagraph"/>
-        <w:numPr>
-          <w:ilvl w:val="0"/>
-          <w:numId w:val="1"/>
-        </w:numPr>
-        <w:spacing w:after="60"/>
-      </w:pPr>
-      <w:r>
-        <w:t xml:space="preserve">Cú pháp quy định thanh toán tự động cho Vé sự kiện và Hội phí.</w:t>
-      </w:r>
-    </w:p>
-    <w:p>
-      <w:pPr>
-        <w:spacing w:after="100"/>
-      </w:pPr>
-      <w:r>
-        <w:rPr>
-          <w:sz w:val="21"/>
-          <w:szCs w:val="21"/>
-        </w:rPr>
-        <w:t xml:space="preserve">3. Nhấn **"Lưu cấu hình"**: Toàn bộ mã QR động sinh ra trên App và Web sẽ tự động trỏ về tài khoản này.</w:t>
+        <w:t xml:space="preserve">11. QUẢN LÝ TIN TỨC, NGHỊ QUYẾT &amp; TRUYỀN THÔNG (NEWS &amp; MEDIA)</w:t>
+      </w:r>
+    </w:p>
+    <w:p>
+      <w:pPr>
+        <w:spacing w:after="100"/>
+      </w:pPr>
+      <w:r>
+        <w:rPr>
+          <w:sz w:val="21"/>
+          <w:szCs w:val="21"/>
+        </w:rPr>
+        <w:t xml:space="preserve">1. Truy cập CRM menu **"Truyền thông &amp; Tin tức"** (`/news`).</w:t>
+      </w:r>
+    </w:p>
+    <w:p>
+      <w:pPr>
+        <w:spacing w:after="100"/>
+      </w:pPr>
+      <w:r>
+        <w:rPr>
+          <w:sz w:val="21"/>
+          <w:szCs w:val="21"/>
+        </w:rPr>
+        <w:t xml:space="preserve">2. Nhấn nút **"+ Soạn Tin Mới"**:</w:t>
+      </w:r>
+    </w:p>
+    <w:p>
+      <w:pPr>
+        <w:pStyle w:val="ListParagraph"/>
+        <w:numPr>
+          <w:ilvl w:val="0"/>
+          <w:numId w:val="1"/>
+        </w:numPr>
+        <w:spacing w:after="60"/>
+      </w:pPr>
+      <w:r>
+        <w:t xml:space="preserve">Nhập Tiêu đề bản tin hoạt động hiệp hội.</w:t>
+      </w:r>
+    </w:p>
+    <w:p>
+      <w:pPr>
+        <w:pStyle w:val="ListParagraph"/>
+        <w:numPr>
+          <w:ilvl w:val="0"/>
+          <w:numId w:val="1"/>
+        </w:numPr>
+        <w:spacing w:after="60"/>
+      </w:pPr>
+      <w:r>
+        <w:t xml:space="preserve">Chọn Chuyên mục: Tin Đại hội, Bản tin Xúc tiến Thương mại, Quyết định Ban Chấp Hành, Tin Doanh nghiệp Hội viên.</w:t>
+      </w:r>
+    </w:p>
+    <w:p>
+      <w:pPr>
+        <w:pStyle w:val="ListParagraph"/>
+        <w:numPr>
+          <w:ilvl w:val="0"/>
+          <w:numId w:val="1"/>
+        </w:numPr>
+        <w:spacing w:after="60"/>
+      </w:pPr>
+      <w:r>
+        <w:t xml:space="preserve">Tải lên ảnh bìa và các hình ảnh phóng sự chất lượng cao.</w:t>
+      </w:r>
+    </w:p>
+    <w:p>
+      <w:pPr>
+        <w:pStyle w:val="ListParagraph"/>
+        <w:numPr>
+          <w:ilvl w:val="0"/>
+          <w:numId w:val="1"/>
+        </w:numPr>
+        <w:spacing w:after="60"/>
+      </w:pPr>
+      <w:r>
+        <w:t xml:space="preserve">Soạn thảo nội dung bài viết với trình soạn thảo phong phú (Rich Text Editor).</w:t>
+      </w:r>
+    </w:p>
+    <w:p>
+      <w:pPr>
+        <w:spacing w:after="100"/>
+      </w:pPr>
+      <w:r>
+        <w:rPr>
+          <w:sz w:val="21"/>
+          <w:szCs w:val="21"/>
+        </w:rPr>
+        <w:t xml:space="preserve">3. Tùy chọn **"Gửi Thông Báo Đẩy (Push Notification) Tới App"**:</w:t>
+      </w:r>
+    </w:p>
+    <w:p>
+      <w:pPr>
+        <w:pStyle w:val="ListParagraph"/>
+        <w:numPr>
+          <w:ilvl w:val="0"/>
+          <w:numId w:val="1"/>
+        </w:numPr>
+        <w:spacing w:after="60"/>
+      </w:pPr>
+      <w:r>
+        <w:t xml:space="preserve">Khi tích chọn mục này và nhấn **"Xuất bản"**, toàn bộ điện thoại của hội viên sẽ nhận được thông báo về tin tức mới.</w:t>
       </w:r>
     </w:p>
     <w:p>
@@ -4402,19 +4210,19 @@
           <w:sz w:val="18"/>
           <w:szCs w:val="18"/>
         </w:rPr>
-        <w:t xml:space="preserve">Hình minh họa: CRM: Cấu hình Tài khoản Ngân hàng và Cổng thanh toán VietQR</w:t>
-      </w:r>
-    </w:p>
-    <w:p>
-      <w:pPr>
-        <w:spacing w:after="100"/>
-      </w:pPr>
-      <w:r>
-        <w:rPr>
-          <w:sz w:val="21"/>
-          <w:szCs w:val="21"/>
-        </w:rPr>
-        <w:t xml:space="preserve">*Hình 12.1: Màn hình cấu hình tài khoản thụ hưởng VietQR và chính sách thanh toán tự động.*</w:t>
+        <w:t xml:space="preserve">Hình minh họa: CRM: Quản lý Tin tức, Bài viết và Truyền thông</w:t>
+      </w:r>
+    </w:p>
+    <w:p>
+      <w:pPr>
+        <w:spacing w:after="100"/>
+      </w:pPr>
+      <w:r>
+        <w:rPr>
+          <w:sz w:val="21"/>
+          <w:szCs w:val="21"/>
+        </w:rPr>
+        <w:t xml:space="preserve">*Hình 11.1: Trình quản lý và xuất bản tin tức, nghị quyết hiệp hội đến ứng dụng di động.*</w:t>
       </w:r>
     </w:p>
     <w:p>
@@ -4427,6 +4235,15 @@
           <w:szCs w:val="21"/>
         </w:rPr>
         <w:t xml:space="preserve">---</w:t>
+      </w:r>
+    </w:p>
+    <w:p>
+      <w:pPr>
+        <w:pStyle w:val="Heading2"/>
+        <w:spacing w:after="100" w:before="240"/>
+      </w:pPr>
+      <w:r>
+        <w:t xml:space="preserve">12. CẤU HÌNH HỆ THỐNG, TÀI KHOẢN VIETQR THỤ HƯỞNG &amp; NHẬT KÝ KIỂM TOÁN</w:t>
       </w:r>
     </w:p>
     <w:p>
@@ -4435,57 +4252,95 @@
         <w:spacing w:after="80" w:before="180"/>
       </w:pPr>
       <w:r>
-        <w:t xml:space="preserve">12.2. Quản Lý Danh Sách Quản Trị Viên &amp; Nhật Ký Kiểm Toán (Audit Logs)</w:t>
-      </w:r>
-    </w:p>
-    <w:p>
-      <w:pPr>
-        <w:spacing w:after="100"/>
-      </w:pPr>
-      <w:r>
-        <w:rPr>
-          <w:sz w:val="21"/>
-          <w:szCs w:val="21"/>
-        </w:rPr>
-        <w:t xml:space="preserve">1. **Quản lý Tài khoản Quản trị:** Cấp phát tài khoản mới cho cán bộ thư ký, khóa tài khoản nhân sự nghỉ việc.</w:t>
-      </w:r>
-    </w:p>
-    <w:p>
-      <w:pPr>
-        <w:spacing w:after="100"/>
-      </w:pPr>
-      <w:r>
-        <w:rPr>
-          <w:sz w:val="21"/>
-          <w:szCs w:val="21"/>
-        </w:rPr>
-        <w:t xml:space="preserve">2. **Nhật ký Kiểm toán (Audit Logs):**</w:t>
-      </w:r>
-    </w:p>
-    <w:p>
-      <w:pPr>
-        <w:pStyle w:val="ListParagraph"/>
-        <w:numPr>
-          <w:ilvl w:val="0"/>
-          <w:numId w:val="1"/>
-        </w:numPr>
-        <w:spacing w:after="60"/>
-      </w:pPr>
-      <w:r>
-        <w:t xml:space="preserve">Hệ thống tự động ghi lại mọi thao tác quan trọng: Ai duyệt hội viên, ai gạch nợ hội phí, ai tạo sự kiện, vào thời gian nào kèm địa chỉ IP truy cập.</w:t>
-      </w:r>
-    </w:p>
-    <w:p>
-      <w:pPr>
-        <w:pStyle w:val="ListParagraph"/>
-        <w:numPr>
-          <w:ilvl w:val="0"/>
-          <w:numId w:val="1"/>
-        </w:numPr>
-        <w:spacing w:after="60"/>
-      </w:pPr>
-      <w:r>
-        <w:t xml:space="preserve">Đảm bảo tính minh bạch và an toàn tuyệt đối cho cơ sở dữ liệu hiệp hội.</w:t>
+        <w:t xml:space="preserve">12.1. Cấu Hình Tài Khoản VietQR Thụ Hưởng</w:t>
+      </w:r>
+    </w:p>
+    <w:p>
+      <w:pPr>
+        <w:spacing w:after="100"/>
+      </w:pPr>
+      <w:r>
+        <w:rPr>
+          <w:sz w:val="21"/>
+          <w:szCs w:val="21"/>
+        </w:rPr>
+        <w:t xml:space="preserve">1. Truy cập CRM menu **"Cài đặt Hệ thống" ➔ "Tài chính &amp; Thanh toán"**.</w:t>
+      </w:r>
+    </w:p>
+    <w:p>
+      <w:pPr>
+        <w:spacing w:after="100"/>
+      </w:pPr>
+      <w:r>
+        <w:rPr>
+          <w:sz w:val="21"/>
+          <w:szCs w:val="21"/>
+        </w:rPr>
+        <w:t xml:space="preserve">2. Thiết lập thông tin tài khoản ngân hàng chính thức của CLB Doanh nhân CEO 1983:</w:t>
+      </w:r>
+    </w:p>
+    <w:p>
+      <w:pPr>
+        <w:pStyle w:val="ListParagraph"/>
+        <w:numPr>
+          <w:ilvl w:val="0"/>
+          <w:numId w:val="1"/>
+        </w:numPr>
+        <w:spacing w:after="60"/>
+      </w:pPr>
+      <w:r>
+        <w:t xml:space="preserve">Tên ngân hàng thụ hưởng (vd: Vietcombank, MB Bank, Techcombank).</w:t>
+      </w:r>
+    </w:p>
+    <w:p>
+      <w:pPr>
+        <w:pStyle w:val="ListParagraph"/>
+        <w:numPr>
+          <w:ilvl w:val="0"/>
+          <w:numId w:val="1"/>
+        </w:numPr>
+        <w:spacing w:after="60"/>
+      </w:pPr>
+      <w:r>
+        <w:t xml:space="preserve">Số tài khoản ngân hàng.</w:t>
+      </w:r>
+    </w:p>
+    <w:p>
+      <w:pPr>
+        <w:pStyle w:val="ListParagraph"/>
+        <w:numPr>
+          <w:ilvl w:val="0"/>
+          <w:numId w:val="1"/>
+        </w:numPr>
+        <w:spacing w:after="60"/>
+      </w:pPr>
+      <w:r>
+        <w:t xml:space="preserve">Tên chủ tài khoản: `CLB DOANH NHAN CEO 1983` hoặc đại diện được ủy quyền.</w:t>
+      </w:r>
+    </w:p>
+    <w:p>
+      <w:pPr>
+        <w:pStyle w:val="ListParagraph"/>
+        <w:numPr>
+          <w:ilvl w:val="0"/>
+          <w:numId w:val="1"/>
+        </w:numPr>
+        <w:spacing w:after="60"/>
+      </w:pPr>
+      <w:r>
+        <w:t xml:space="preserve">Cú pháp quy định thanh toán tự động cho Vé sự kiện và Hội phí.</w:t>
+      </w:r>
+    </w:p>
+    <w:p>
+      <w:pPr>
+        <w:spacing w:after="100"/>
+      </w:pPr>
+      <w:r>
+        <w:rPr>
+          <w:sz w:val="21"/>
+          <w:szCs w:val="21"/>
+        </w:rPr>
+        <w:t xml:space="preserve">3. Nhấn **"Lưu cấu hình"**: Toàn bộ mã QR động sinh ra trên App và Web sẽ tự động trỏ về tài khoản này.</w:t>
       </w:r>
     </w:p>
     <w:p>
@@ -4513,6 +4368,151 @@
                   </pic:nvPicPr>
                   <pic:blipFill>
                     <a:blip r:embed="rId27" cstate="none"/>
+                    <a:srcRect/>
+                    <a:stretch>
+                      <a:fillRect/>
+                    </a:stretch>
+                  </pic:blipFill>
+                  <pic:spPr bwMode="auto">
+                    <a:xfrm>
+                      <a:off x="0" y="0"/>
+                      <a:ext cx="4762500" cy="2667000"/>
+                    </a:xfrm>
+                    <a:prstGeom prst="rect">
+                      <a:avLst/>
+                    </a:prstGeom>
+                  </pic:spPr>
+                </pic:pic>
+              </a:graphicData>
+            </a:graphic>
+          </wp:inline>
+        </w:drawing>
+      </w:r>
+    </w:p>
+    <w:p>
+      <w:pPr>
+        <w:spacing w:after="140"/>
+        <w:jc w:val="center"/>
+      </w:pPr>
+      <w:r>
+        <w:rPr>
+          <w:i/>
+          <w:iCs/>
+          <w:color w:val="555555"/>
+          <w:sz w:val="18"/>
+          <w:szCs w:val="18"/>
+        </w:rPr>
+        <w:t xml:space="preserve">Hình minh họa: CRM: Cấu hình Tài khoản Ngân hàng và Cổng thanh toán VietQR</w:t>
+      </w:r>
+    </w:p>
+    <w:p>
+      <w:pPr>
+        <w:spacing w:after="100"/>
+      </w:pPr>
+      <w:r>
+        <w:rPr>
+          <w:sz w:val="21"/>
+          <w:szCs w:val="21"/>
+        </w:rPr>
+        <w:t xml:space="preserve">*Hình 12.1: Màn hình cấu hình tài khoản thụ hưởng VietQR và chính sách thanh toán tự động.*</w:t>
+      </w:r>
+    </w:p>
+    <w:p>
+      <w:pPr>
+        <w:spacing w:after="100"/>
+      </w:pPr>
+      <w:r>
+        <w:rPr>
+          <w:sz w:val="21"/>
+          <w:szCs w:val="21"/>
+        </w:rPr>
+        <w:t xml:space="preserve">---</w:t>
+      </w:r>
+    </w:p>
+    <w:p>
+      <w:pPr>
+        <w:pStyle w:val="Heading3"/>
+        <w:spacing w:after="80" w:before="180"/>
+      </w:pPr>
+      <w:r>
+        <w:t xml:space="preserve">12.2. Quản Lý Danh Sách Quản Trị Viên &amp; Nhật Ký Kiểm Toán (Audit Logs)</w:t>
+      </w:r>
+    </w:p>
+    <w:p>
+      <w:pPr>
+        <w:spacing w:after="100"/>
+      </w:pPr>
+      <w:r>
+        <w:rPr>
+          <w:sz w:val="21"/>
+          <w:szCs w:val="21"/>
+        </w:rPr>
+        <w:t xml:space="preserve">1. **Quản lý Tài khoản Quản trị:** Cấp phát tài khoản mới cho cán bộ thư ký, khóa tài khoản nhân sự nghỉ việc.</w:t>
+      </w:r>
+    </w:p>
+    <w:p>
+      <w:pPr>
+        <w:spacing w:after="100"/>
+      </w:pPr>
+      <w:r>
+        <w:rPr>
+          <w:sz w:val="21"/>
+          <w:szCs w:val="21"/>
+        </w:rPr>
+        <w:t xml:space="preserve">2. **Nhật ký Kiểm toán (Audit Logs):**</w:t>
+      </w:r>
+    </w:p>
+    <w:p>
+      <w:pPr>
+        <w:pStyle w:val="ListParagraph"/>
+        <w:numPr>
+          <w:ilvl w:val="0"/>
+          <w:numId w:val="1"/>
+        </w:numPr>
+        <w:spacing w:after="60"/>
+      </w:pPr>
+      <w:r>
+        <w:t xml:space="preserve">Hệ thống tự động ghi lại mọi thao tác quan trọng: Ai duyệt hội viên, ai gạch nợ hội phí, ai tạo sự kiện, vào thời gian nào kèm địa chỉ IP truy cập.</w:t>
+      </w:r>
+    </w:p>
+    <w:p>
+      <w:pPr>
+        <w:pStyle w:val="ListParagraph"/>
+        <w:numPr>
+          <w:ilvl w:val="0"/>
+          <w:numId w:val="1"/>
+        </w:numPr>
+        <w:spacing w:after="60"/>
+      </w:pPr>
+      <w:r>
+        <w:t xml:space="preserve">Đảm bảo tính minh bạch và an toàn tuyệt đối cho cơ sở dữ liệu hiệp hội.</w:t>
+      </w:r>
+    </w:p>
+    <w:p>
+      <w:pPr>
+        <w:spacing w:after="60" w:before="140"/>
+        <w:jc w:val="center"/>
+      </w:pPr>
+      <w:r>
+        <w:drawing>
+          <wp:inline distT="0" distB="0" distL="0" distR="0">
+            <wp:extent cx="4762500" cy="2667000"/>
+            <wp:effectExtent t="0" r="0" b="0" l="0"/>
+            <wp:docPr id="1" name="" descr="" title=""/>
+            <wp:cNvGraphicFramePr>
+              <a:graphicFrameLocks xmlns:a="http://schemas.openxmlformats.org/drawingml/2006/main" noChangeAspect="1"/>
+            </wp:cNvGraphicFramePr>
+            <a:graphic xmlns:a="http://schemas.openxmlformats.org/drawingml/2006/main">
+              <a:graphicData uri="http://schemas.openxmlformats.org/drawingml/2006/picture">
+                <pic:pic xmlns:pic="http://schemas.openxmlformats.org/drawingml/2006/picture">
+                  <pic:nvPicPr>
+                    <pic:cNvPr id="0" name="" descr=""/>
+                    <pic:cNvPicPr>
+                      <a:picLocks noChangeAspect="1" noChangeArrowheads="1"/>
+                    </pic:cNvPicPr>
+                  </pic:nvPicPr>
+                  <pic:blipFill>
+                    <a:blip r:embed="rId28" cstate="none"/>
                     <a:srcRect/>
                     <a:stretch>
                       <a:fillRect/>

</xml_diff>